<commit_message>
docs: auditoria metodologica da definicao de sucesso de bilheteria
</commit_message>
<xml_diff>
--- a/docs/Relatorio_Entrega_1_Grupo_11.docx
+++ b/docs/Relatorio_Entrega_1_Grupo_11.docx
@@ -515,7 +515,7 @@
     </w:p>
     <w:p>
       <w:pPr>
-        <w:spacing w:after="120" w:before="0" w:line="276"/>
+        <w:spacing w:after="120" w:before="160" w:line="276"/>
         <w:jc w:val="both"/>
       </w:pPr>
       <w:r>
@@ -528,7 +528,25 @@
           <w:sz w:val="22"/>
           <w:szCs w:val="22"/>
         </w:rPr>
-        <w:t xml:space="preserve">O relatório documenta a base, os resultados da análise exploratória, os treze problemas identificados e as catorze hipóteses de pré-processamento, cada uma acompanhada da medida do que custa e do que vale.</w:t>
+        <w:t xml:space="preserve">Há ainda um quarto caminho, que não está nos atributos nem na validação, e sim na própria definição de sucesso. A auditoria da variável-alvo, apresentada na seção 2.7, mostra que o público brasileiro não é uma distribuição a ser partida ao meio, e sim uma mistura de duas populações: circuito limitado, com 64% dos filmes e centro em 915 espectadores, e lançamento comercial, com 36% e centro em 51.402. A fronteira entre elas está no percentil 69, e a mediana cai dentro da primeira. O corte pela mediana, portanto, separa circuito limitado bom de circuito limitado ruim.</w:t>
+      </w:r>
+    </w:p>
+    <w:p>
+      <w:pPr>
+        <w:spacing w:after="120" w:before="0" w:line="276"/>
+        <w:jc w:val="both"/>
+      </w:pPr>
+      <w:r>
+        <w:rPr>
+          <w:rFonts w:ascii="Arial" w:cs="Arial" w:eastAsia="Arial" w:hAnsi="Arial"/>
+          <w:b w:val="false"/>
+          <w:bCs w:val="false"/>
+          <w:i w:val="false"/>
+          <w:iCs w:val="false"/>
+          <w:sz w:val="22"/>
+          <w:szCs w:val="22"/>
+        </w:rPr>
+        <w:t xml:space="preserve">O relatório documenta a base, os resultados da análise exploratória, os quinze problemas identificados e as catorze hipóteses de pré-processamento, cada uma acompanhada da medida do que custa e do que vale.</w:t>
       </w:r>
     </w:p>
     <w:p>
@@ -5096,6 +5114,441 @@
     </w:p>
     <w:p>
       <w:pPr>
+        <w:pStyle w:val="Heading2"/>
+        <w:spacing w:after="140" w:before="280"/>
+      </w:pPr>
+      <w:r>
+        <w:rPr>
+          <w:rFonts w:ascii="Arial" w:cs="Arial" w:eastAsia="Arial" w:hAnsi="Arial"/>
+          <w:b/>
+          <w:bCs/>
+          <w:color w:val="000000"/>
+          <w:sz w:val="24"/>
+          <w:szCs w:val="24"/>
+        </w:rPr>
+        <w:t xml:space="preserve">2.7 O corte que os dados propõem</w:t>
+      </w:r>
+    </w:p>
+    <w:p>
+      <w:pPr>
+        <w:spacing w:after="120" w:before="160" w:line="276"/>
+        <w:jc w:val="both"/>
+      </w:pPr>
+      <w:r>
+        <w:rPr>
+          <w:rFonts w:ascii="Arial" w:cs="Arial" w:eastAsia="Arial" w:hAnsi="Arial"/>
+          <w:b w:val="false"/>
+          <w:bCs w:val="false"/>
+          <w:i w:val="false"/>
+          <w:iCs w:val="false"/>
+          <w:sz w:val="22"/>
+          <w:szCs w:val="22"/>
+        </w:rPr>
+        <w:t xml:space="preserve">A seção 2.1 concluiu que a distribuição do público se aproxima de uma log-normal. O advérbio importa. Se em escala logarítmica houvesse uma única gaussiana, a mediana seria um centro legítimo e cortar nela seria defensável. Testamos essa hipótese ajustando uma mistura de duas gaussianas ao logaritmo do público e comparando o critério de informação bayesiano com o de uma componente só.</w:t>
+      </w:r>
+    </w:p>
+    <w:p>
+      <w:pPr>
+        <w:spacing w:after="120" w:before="160" w:line="276"/>
+        <w:jc w:val="both"/>
+      </w:pPr>
+      <w:r>
+        <w:rPr>
+          <w:rFonts w:ascii="Arial" w:cs="Arial" w:eastAsia="Arial" w:hAnsi="Arial"/>
+          <w:b w:val="false"/>
+          <w:bCs w:val="false"/>
+          <w:i w:val="false"/>
+          <w:iCs w:val="false"/>
+          <w:sz w:val="22"/>
+          <w:szCs w:val="22"/>
+        </w:rPr>
+        <w:t xml:space="preserve">O critério escolhe duas componentes, com 8.260 contra 8.358, e ambas têm leitura direta no domínio do cinema.</w:t>
+      </w:r>
+    </w:p>
+    <w:tbl>
+      <w:tblPr>
+        <w:tblW w:type="dxa" w:w="9026"/>
+        <w:tblBorders>
+          <w:top w:val="single" w:color="auto" w:sz="4"/>
+          <w:left w:val="single" w:color="auto" w:sz="4"/>
+          <w:bottom w:val="single" w:color="auto" w:sz="4"/>
+          <w:right w:val="single" w:color="auto" w:sz="4"/>
+          <w:insideH w:val="single" w:color="auto" w:sz="4"/>
+          <w:insideV w:val="single" w:color="auto" w:sz="4"/>
+        </w:tblBorders>
+      </w:tblPr>
+      <w:tblGrid>
+        <w:gridCol w:w="3600"/>
+        <w:gridCol w:w="2600"/>
+        <w:gridCol w:w="2826"/>
+      </w:tblGrid>
+      <w:tr>
+        <w:trPr>
+          <w:tblHeader/>
+        </w:trPr>
+        <w:tc>
+          <w:tcPr>
+            <w:tcW w:type="dxa" w:w="3600"/>
+            <w:shd w:fill="E8E8E8" w:val="clear"/>
+            <w:tcMar>
+              <w:top w:type="dxa" w:w="60"/>
+              <w:left w:type="dxa" w:w="100"/>
+              <w:bottom w:type="dxa" w:w="60"/>
+              <w:right w:type="dxa" w:w="100"/>
+            </w:tcMar>
+          </w:tcPr>
+          <w:p>
+            <w:pPr>
+              <w:spacing w:after="0" w:line="240"/>
+              <w:jc w:val="center"/>
+            </w:pPr>
+            <w:r>
+              <w:rPr>
+                <w:rFonts w:ascii="Arial" w:cs="Arial" w:eastAsia="Arial" w:hAnsi="Arial"/>
+                <w:b/>
+                <w:bCs/>
+                <w:sz w:val="20"/>
+                <w:szCs w:val="20"/>
+              </w:rPr>
+              <w:t xml:space="preserve">Componente</w:t>
+            </w:r>
+          </w:p>
+        </w:tc>
+        <w:tc>
+          <w:tcPr>
+            <w:tcW w:type="dxa" w:w="2600"/>
+            <w:shd w:fill="E8E8E8" w:val="clear"/>
+            <w:tcMar>
+              <w:top w:type="dxa" w:w="60"/>
+              <w:left w:type="dxa" w:w="100"/>
+              <w:bottom w:type="dxa" w:w="60"/>
+              <w:right w:type="dxa" w:w="100"/>
+            </w:tcMar>
+          </w:tcPr>
+          <w:p>
+            <w:pPr>
+              <w:spacing w:after="0" w:line="240"/>
+              <w:jc w:val="center"/>
+            </w:pPr>
+            <w:r>
+              <w:rPr>
+                <w:rFonts w:ascii="Arial" w:cs="Arial" w:eastAsia="Arial" w:hAnsi="Arial"/>
+                <w:b/>
+                <w:bCs/>
+                <w:sz w:val="20"/>
+                <w:szCs w:val="20"/>
+              </w:rPr>
+              <w:t xml:space="preserve">Participação</w:t>
+            </w:r>
+          </w:p>
+        </w:tc>
+        <w:tc>
+          <w:tcPr>
+            <w:tcW w:type="dxa" w:w="2826"/>
+            <w:shd w:fill="E8E8E8" w:val="clear"/>
+            <w:tcMar>
+              <w:top w:type="dxa" w:w="60"/>
+              <w:left w:type="dxa" w:w="100"/>
+              <w:bottom w:type="dxa" w:w="60"/>
+              <w:right w:type="dxa" w:w="100"/>
+            </w:tcMar>
+          </w:tcPr>
+          <w:p>
+            <w:pPr>
+              <w:spacing w:after="0" w:line="240"/>
+              <w:jc w:val="center"/>
+            </w:pPr>
+            <w:r>
+              <w:rPr>
+                <w:rFonts w:ascii="Arial" w:cs="Arial" w:eastAsia="Arial" w:hAnsi="Arial"/>
+                <w:b/>
+                <w:bCs/>
+                <w:sz w:val="20"/>
+                <w:szCs w:val="20"/>
+              </w:rPr>
+              <w:t xml:space="preserve">Centro</w:t>
+            </w:r>
+          </w:p>
+        </w:tc>
+      </w:tr>
+      <w:tr>
+        <w:tc>
+          <w:tcPr>
+            <w:tcW w:type="dxa" w:w="3600"/>
+            <w:tcMar>
+              <w:top w:type="dxa" w:w="60"/>
+              <w:left w:type="dxa" w:w="100"/>
+              <w:bottom w:type="dxa" w:w="60"/>
+              <w:right w:type="dxa" w:w="100"/>
+            </w:tcMar>
+          </w:tcPr>
+          <w:p>
+            <w:pPr>
+              <w:spacing w:after="0" w:line="240"/>
+              <w:jc w:val="center"/>
+            </w:pPr>
+            <w:r>
+              <w:rPr>
+                <w:rFonts w:ascii="Arial" w:cs="Arial" w:eastAsia="Arial" w:hAnsi="Arial"/>
+                <w:sz w:val="20"/>
+                <w:szCs w:val="20"/>
+              </w:rPr>
+              <w:t xml:space="preserve">Circuito limitado</w:t>
+            </w:r>
+          </w:p>
+        </w:tc>
+        <w:tc>
+          <w:tcPr>
+            <w:tcW w:type="dxa" w:w="2600"/>
+            <w:tcMar>
+              <w:top w:type="dxa" w:w="60"/>
+              <w:left w:type="dxa" w:w="100"/>
+              <w:bottom w:type="dxa" w:w="60"/>
+              <w:right w:type="dxa" w:w="100"/>
+            </w:tcMar>
+          </w:tcPr>
+          <w:p>
+            <w:pPr>
+              <w:spacing w:after="0" w:line="240"/>
+              <w:jc w:val="center"/>
+            </w:pPr>
+            <w:r>
+              <w:rPr>
+                <w:rFonts w:ascii="Arial" w:cs="Arial" w:eastAsia="Arial" w:hAnsi="Arial"/>
+                <w:sz w:val="20"/>
+                <w:szCs w:val="20"/>
+              </w:rPr>
+              <w:t xml:space="preserve">64% dos filmes</w:t>
+            </w:r>
+          </w:p>
+        </w:tc>
+        <w:tc>
+          <w:tcPr>
+            <w:tcW w:type="dxa" w:w="2826"/>
+            <w:tcMar>
+              <w:top w:type="dxa" w:w="60"/>
+              <w:left w:type="dxa" w:w="100"/>
+              <w:bottom w:type="dxa" w:w="60"/>
+              <w:right w:type="dxa" w:w="100"/>
+            </w:tcMar>
+          </w:tcPr>
+          <w:p>
+            <w:pPr>
+              <w:spacing w:after="0" w:line="240"/>
+              <w:jc w:val="center"/>
+            </w:pPr>
+            <w:r>
+              <w:rPr>
+                <w:rFonts w:ascii="Arial" w:cs="Arial" w:eastAsia="Arial" w:hAnsi="Arial"/>
+                <w:sz w:val="20"/>
+                <w:szCs w:val="20"/>
+              </w:rPr>
+              <w:t xml:space="preserve">915 espectadores</w:t>
+            </w:r>
+          </w:p>
+        </w:tc>
+      </w:tr>
+      <w:tr>
+        <w:tc>
+          <w:tcPr>
+            <w:tcW w:type="dxa" w:w="3600"/>
+            <w:tcMar>
+              <w:top w:type="dxa" w:w="60"/>
+              <w:left w:type="dxa" w:w="100"/>
+              <w:bottom w:type="dxa" w:w="60"/>
+              <w:right w:type="dxa" w:w="100"/>
+            </w:tcMar>
+          </w:tcPr>
+          <w:p>
+            <w:pPr>
+              <w:spacing w:after="0" w:line="240"/>
+              <w:jc w:val="center"/>
+            </w:pPr>
+            <w:r>
+              <w:rPr>
+                <w:rFonts w:ascii="Arial" w:cs="Arial" w:eastAsia="Arial" w:hAnsi="Arial"/>
+                <w:sz w:val="20"/>
+                <w:szCs w:val="20"/>
+              </w:rPr>
+              <w:t xml:space="preserve">Lançamento comercial</w:t>
+            </w:r>
+          </w:p>
+        </w:tc>
+        <w:tc>
+          <w:tcPr>
+            <w:tcW w:type="dxa" w:w="2600"/>
+            <w:tcMar>
+              <w:top w:type="dxa" w:w="60"/>
+              <w:left w:type="dxa" w:w="100"/>
+              <w:bottom w:type="dxa" w:w="60"/>
+              <w:right w:type="dxa" w:w="100"/>
+            </w:tcMar>
+          </w:tcPr>
+          <w:p>
+            <w:pPr>
+              <w:spacing w:after="0" w:line="240"/>
+              <w:jc w:val="center"/>
+            </w:pPr>
+            <w:r>
+              <w:rPr>
+                <w:rFonts w:ascii="Arial" w:cs="Arial" w:eastAsia="Arial" w:hAnsi="Arial"/>
+                <w:sz w:val="20"/>
+                <w:szCs w:val="20"/>
+              </w:rPr>
+              <w:t xml:space="preserve">36% dos filmes</w:t>
+            </w:r>
+          </w:p>
+        </w:tc>
+        <w:tc>
+          <w:tcPr>
+            <w:tcW w:type="dxa" w:w="2826"/>
+            <w:tcMar>
+              <w:top w:type="dxa" w:w="60"/>
+              <w:left w:type="dxa" w:w="100"/>
+              <w:bottom w:type="dxa" w:w="60"/>
+              <w:right w:type="dxa" w:w="100"/>
+            </w:tcMar>
+          </w:tcPr>
+          <w:p>
+            <w:pPr>
+              <w:spacing w:after="0" w:line="240"/>
+              <w:jc w:val="center"/>
+            </w:pPr>
+            <w:r>
+              <w:rPr>
+                <w:rFonts w:ascii="Arial" w:cs="Arial" w:eastAsia="Arial" w:hAnsi="Arial"/>
+                <w:sz w:val="20"/>
+                <w:szCs w:val="20"/>
+              </w:rPr>
+              <w:t xml:space="preserve">51.402 espectadores</w:t>
+            </w:r>
+          </w:p>
+        </w:tc>
+      </w:tr>
+    </w:tbl>
+    <w:p>
+      <w:pPr>
+        <w:spacing w:after="160"/>
+      </w:pPr>
+    </w:p>
+    <w:p>
+      <w:pPr>
+        <w:spacing w:after="120" w:before="160" w:line="276"/>
+        <w:jc w:val="both"/>
+      </w:pPr>
+      <w:r>
+        <w:rPr>
+          <w:rFonts w:ascii="Arial" w:cs="Arial" w:eastAsia="Arial" w:hAnsi="Arial"/>
+          <w:b w:val="false"/>
+          <w:bCs w:val="false"/>
+          <w:i w:val="false"/>
+          <w:iCs w:val="false"/>
+          <w:sz w:val="22"/>
+          <w:szCs w:val="22"/>
+        </w:rPr>
+        <w:t xml:space="preserve">A fronteira entre as duas populações, definida como o público em que uma componente passa a predominar sobre a outra, situa-se em 11.830 espectadores, o percentil 69 da base. Noventa por cento dos documentários pertencem à primeira componente.</w:t>
+      </w:r>
+    </w:p>
+    <w:p>
+      <w:pPr>
+        <w:spacing w:after="120" w:before="160" w:line="276"/>
+        <w:jc w:val="both"/>
+      </w:pPr>
+      <w:r>
+        <w:rPr>
+          <w:rFonts w:ascii="Arial" w:cs="Arial" w:eastAsia="Arial" w:hAnsi="Arial"/>
+          <w:b w:val="false"/>
+          <w:bCs w:val="false"/>
+          <w:i w:val="false"/>
+          <w:iCs w:val="false"/>
+          <w:sz w:val="22"/>
+          <w:szCs w:val="22"/>
+        </w:rPr>
+        <w:t xml:space="preserve">Três consequências decorrem desse resultado. A primeira é que a mediana da base, 2.806 espectadores, situa-se dentro da população de circuito limitado: o corte pela mediana não separa sucesso comercial de fracasso comercial, e sim circuito limitado bom de circuito limitado ruim. A segunda é que o quartil superior é o quantil arredondado que coincide com a fronteira empírica, e portanto o único corte deste relatório que não foi escolhido por conveniência. A terceira é que o patamar comercial se manteve estável entre 108 mil e 130 mil espectadores nas décadas de 1990, 2000 e 2010, colapsando apenas na década de 2020, para 9.687; a mediana, no mesmo intervalo, caiu de 24.704 para 573. O que se desfez não foi o cinema comercial brasileiro, e sim a composição da lista de lançamentos.</w:t>
+      </w:r>
+    </w:p>
+    <w:p>
+      <w:pPr>
+        <w:spacing w:after="120" w:before="160" w:line="276"/>
+        <w:jc w:val="both"/>
+      </w:pPr>
+      <w:r>
+        <w:rPr>
+          <w:rFonts w:ascii="Arial" w:cs="Arial" w:eastAsia="Arial" w:hAnsi="Arial"/>
+          <w:b w:val="false"/>
+          <w:bCs w:val="false"/>
+          <w:i w:val="false"/>
+          <w:iCs w:val="false"/>
+          <w:sz w:val="22"/>
+          <w:szCs w:val="22"/>
+        </w:rPr>
+        <w:t xml:space="preserve">Uma implicação metodológica se impõe. O equilíbrio de 50% que o corte pela mediana produz não constitui evidência de boa definição, pois cortar na mediana devolve metade e metade em qualquer distribuição, inclusive naquela em que 1% dos filmes concentra 36,2% do público. A recomendação que este relatório leva para a segunda entrega é definir sucesso como público superior ao percentil 75 dos filmes lançados no ano anterior, com todo resultado reportado também nos cortes de 50% e 90%. A auditoria completa da variável-alvo está documentada em docs/04-auditoria-do-alvo.md.</w:t>
+      </w:r>
+    </w:p>
+    <w:p>
+      <w:pPr>
+        <w:spacing w:after="80" w:before="200"/>
+        <w:jc w:val="center"/>
+      </w:pPr>
+      <w:r>
+        <w:drawing>
+          <wp:inline distT="0" distB="0" distL="0" distR="0">
+            <wp:extent cx="5715000" cy="1965302"/>
+            <wp:effectExtent t="0" r="0" b="0" l="0"/>
+            <wp:docPr id="6" name="" descr="" title=""/>
+            <wp:cNvGraphicFramePr>
+              <a:graphicFrameLocks xmlns:a="http://schemas.openxmlformats.org/drawingml/2006/main" noChangeAspect="1"/>
+            </wp:cNvGraphicFramePr>
+            <a:graphic xmlns:a="http://schemas.openxmlformats.org/drawingml/2006/main">
+              <a:graphicData uri="http://schemas.openxmlformats.org/drawingml/2006/picture">
+                <pic:pic xmlns:pic="http://schemas.openxmlformats.org/drawingml/2006/picture">
+                  <pic:nvPicPr>
+                    <pic:cNvPr id="0" name="" descr=""/>
+                    <pic:cNvPicPr>
+                      <a:picLocks noChangeAspect="1" noChangeArrowheads="1"/>
+                    </pic:cNvPicPr>
+                  </pic:nvPicPr>
+                  <pic:blipFill>
+                    <a:blip r:embed="rId13" cstate="none"/>
+                    <a:srcRect/>
+                    <a:stretch>
+                      <a:fillRect/>
+                    </a:stretch>
+                  </pic:blipFill>
+                  <pic:spPr bwMode="auto">
+                    <a:xfrm>
+                      <a:off x="0" y="0"/>
+                      <a:ext cx="5715000" cy="1965302"/>
+                    </a:xfrm>
+                    <a:prstGeom prst="rect">
+                      <a:avLst/>
+                    </a:prstGeom>
+                  </pic:spPr>
+                </pic:pic>
+              </a:graphicData>
+            </a:graphic>
+          </wp:inline>
+        </w:drawing>
+      </w:r>
+    </w:p>
+    <w:p>
+      <w:pPr>
+        <w:spacing w:after="240"/>
+        <w:jc w:val="center"/>
+      </w:pPr>
+      <w:r>
+        <w:rPr>
+          <w:rFonts w:ascii="Arial" w:cs="Arial" w:eastAsia="Arial" w:hAnsi="Arial"/>
+          <w:i/>
+          <w:iCs/>
+          <w:sz w:val="18"/>
+          <w:szCs w:val="18"/>
+        </w:rPr>
+        <w:t xml:space="preserve">Figura 6. Mistura de duas gaussianas no logaritmo do público, com a mediana e a fronteira assinaladas, e a evolução da fronteira por década.</w:t>
+      </w:r>
+    </w:p>
+    <w:p>
+      <w:pPr>
         <w:pStyle w:val="Heading1"/>
         <w:spacing w:after="180" w:before="360"/>
       </w:pPr>
@@ -6565,6 +7018,808 @@
           <w:szCs w:val="22"/>
         </w:rPr>
         <w:t xml:space="preserve">Sem a data de estreia e sem a curva semanal de salas não é possível separar a parcela decidida antes do lançamento daquela que reagiu ao desempenho. Diante disso, a posição do grupo é excluir o atributo do conjunto principal e reportar separadamente quanto ele valeria.</w:t>
+      </w:r>
+    </w:p>
+    <w:p>
+      <w:pPr>
+        <w:pStyle w:val="Heading2"/>
+        <w:spacing w:after="140" w:before="280"/>
+      </w:pPr>
+      <w:r>
+        <w:rPr>
+          <w:rFonts w:ascii="Arial" w:cs="Arial" w:eastAsia="Arial" w:hAnsi="Arial"/>
+          <w:b/>
+          <w:bCs/>
+          <w:color w:val="000000"/>
+          <w:sz w:val="24"/>
+          <w:szCs w:val="24"/>
+        </w:rPr>
+        <w:t xml:space="preserve">3.5 A instabilidade do rótulo</w:t>
+      </w:r>
+    </w:p>
+    <w:p>
+      <w:pPr>
+        <w:spacing w:after="120" w:before="160" w:line="276"/>
+        <w:jc w:val="both"/>
+      </w:pPr>
+      <w:r>
+        <w:rPr>
+          <w:rFonts w:ascii="Arial" w:cs="Arial" w:eastAsia="Arial" w:hAnsi="Arial"/>
+          <w:b w:val="false"/>
+          <w:bCs w:val="false"/>
+          <w:i w:val="false"/>
+          <w:iCs w:val="false"/>
+          <w:sz w:val="22"/>
+          <w:szCs w:val="22"/>
+        </w:rPr>
+        <w:t xml:space="preserve">Um rótulo definido por comparação com a mediana do ano herda a incerteza dessa mediana. Reamostramos cada ano com reposição, em duas mil réplicas, e calculamos o intervalo de confiança de 95% da mediana anual. Um filme cujo público cai dentro desse intervalo tem classe indeterminada: outra amostra do mesmo mercado o colocaria do outro lado do corte.</w:t>
+      </w:r>
+    </w:p>
+    <w:tbl>
+      <w:tblPr>
+        <w:tblW w:type="dxa" w:w="9026"/>
+        <w:tblBorders>
+          <w:top w:val="single" w:color="auto" w:sz="4"/>
+          <w:left w:val="single" w:color="auto" w:sz="4"/>
+          <w:bottom w:val="single" w:color="auto" w:sz="4"/>
+          <w:right w:val="single" w:color="auto" w:sz="4"/>
+          <w:insideH w:val="single" w:color="auto" w:sz="4"/>
+          <w:insideV w:val="single" w:color="auto" w:sz="4"/>
+        </w:tblBorders>
+      </w:tblPr>
+      <w:tblGrid>
+        <w:gridCol w:w="1200"/>
+        <w:gridCol w:w="1200"/>
+        <w:gridCol w:w="1800"/>
+        <w:gridCol w:w="3000"/>
+        <w:gridCol w:w="1826"/>
+      </w:tblGrid>
+      <w:tr>
+        <w:trPr>
+          <w:tblHeader/>
+        </w:trPr>
+        <w:tc>
+          <w:tcPr>
+            <w:tcW w:type="dxa" w:w="1200"/>
+            <w:shd w:fill="E8E8E8" w:val="clear"/>
+            <w:tcMar>
+              <w:top w:type="dxa" w:w="60"/>
+              <w:left w:type="dxa" w:w="100"/>
+              <w:bottom w:type="dxa" w:w="60"/>
+              <w:right w:type="dxa" w:w="100"/>
+            </w:tcMar>
+          </w:tcPr>
+          <w:p>
+            <w:pPr>
+              <w:spacing w:after="0" w:line="240"/>
+              <w:jc w:val="center"/>
+            </w:pPr>
+            <w:r>
+              <w:rPr>
+                <w:rFonts w:ascii="Arial" w:cs="Arial" w:eastAsia="Arial" w:hAnsi="Arial"/>
+                <w:b/>
+                <w:bCs/>
+                <w:sz w:val="20"/>
+                <w:szCs w:val="20"/>
+              </w:rPr>
+              <w:t xml:space="preserve">Ano</w:t>
+            </w:r>
+          </w:p>
+        </w:tc>
+        <w:tc>
+          <w:tcPr>
+            <w:tcW w:type="dxa" w:w="1200"/>
+            <w:shd w:fill="E8E8E8" w:val="clear"/>
+            <w:tcMar>
+              <w:top w:type="dxa" w:w="60"/>
+              <w:left w:type="dxa" w:w="100"/>
+              <w:bottom w:type="dxa" w:w="60"/>
+              <w:right w:type="dxa" w:w="100"/>
+            </w:tcMar>
+          </w:tcPr>
+          <w:p>
+            <w:pPr>
+              <w:spacing w:after="0" w:line="240"/>
+              <w:jc w:val="center"/>
+            </w:pPr>
+            <w:r>
+              <w:rPr>
+                <w:rFonts w:ascii="Arial" w:cs="Arial" w:eastAsia="Arial" w:hAnsi="Arial"/>
+                <w:b/>
+                <w:bCs/>
+                <w:sz w:val="20"/>
+                <w:szCs w:val="20"/>
+              </w:rPr>
+              <w:t xml:space="preserve">Filmes</w:t>
+            </w:r>
+          </w:p>
+        </w:tc>
+        <w:tc>
+          <w:tcPr>
+            <w:tcW w:type="dxa" w:w="1800"/>
+            <w:shd w:fill="E8E8E8" w:val="clear"/>
+            <w:tcMar>
+              <w:top w:type="dxa" w:w="60"/>
+              <w:left w:type="dxa" w:w="100"/>
+              <w:bottom w:type="dxa" w:w="60"/>
+              <w:right w:type="dxa" w:w="100"/>
+            </w:tcMar>
+          </w:tcPr>
+          <w:p>
+            <w:pPr>
+              <w:spacing w:after="0" w:line="240"/>
+              <w:jc w:val="center"/>
+            </w:pPr>
+            <w:r>
+              <w:rPr>
+                <w:rFonts w:ascii="Arial" w:cs="Arial" w:eastAsia="Arial" w:hAnsi="Arial"/>
+                <w:b/>
+                <w:bCs/>
+                <w:sz w:val="20"/>
+                <w:szCs w:val="20"/>
+              </w:rPr>
+              <w:t xml:space="preserve">Mediana</w:t>
+            </w:r>
+          </w:p>
+        </w:tc>
+        <w:tc>
+          <w:tcPr>
+            <w:tcW w:type="dxa" w:w="3000"/>
+            <w:shd w:fill="E8E8E8" w:val="clear"/>
+            <w:tcMar>
+              <w:top w:type="dxa" w:w="60"/>
+              <w:left w:type="dxa" w:w="100"/>
+              <w:bottom w:type="dxa" w:w="60"/>
+              <w:right w:type="dxa" w:w="100"/>
+            </w:tcMar>
+          </w:tcPr>
+          <w:p>
+            <w:pPr>
+              <w:spacing w:after="0" w:line="240"/>
+              <w:jc w:val="center"/>
+            </w:pPr>
+            <w:r>
+              <w:rPr>
+                <w:rFonts w:ascii="Arial" w:cs="Arial" w:eastAsia="Arial" w:hAnsi="Arial"/>
+                <w:b/>
+                <w:bCs/>
+                <w:sz w:val="20"/>
+                <w:szCs w:val="20"/>
+              </w:rPr>
+              <w:t xml:space="preserve">Intervalo de 95%</w:t>
+            </w:r>
+          </w:p>
+        </w:tc>
+        <w:tc>
+          <w:tcPr>
+            <w:tcW w:type="dxa" w:w="1826"/>
+            <w:shd w:fill="E8E8E8" w:val="clear"/>
+            <w:tcMar>
+              <w:top w:type="dxa" w:w="60"/>
+              <w:left w:type="dxa" w:w="100"/>
+              <w:bottom w:type="dxa" w:w="60"/>
+              <w:right w:type="dxa" w:w="100"/>
+            </w:tcMar>
+          </w:tcPr>
+          <w:p>
+            <w:pPr>
+              <w:spacing w:after="0" w:line="240"/>
+              <w:jc w:val="center"/>
+            </w:pPr>
+            <w:r>
+              <w:rPr>
+                <w:rFonts w:ascii="Arial" w:cs="Arial" w:eastAsia="Arial" w:hAnsi="Arial"/>
+                <w:b/>
+                <w:bCs/>
+                <w:sz w:val="20"/>
+                <w:szCs w:val="20"/>
+              </w:rPr>
+              <w:t xml:space="preserve">Indeterminados</w:t>
+            </w:r>
+          </w:p>
+        </w:tc>
+      </w:tr>
+      <w:tr>
+        <w:tc>
+          <w:tcPr>
+            <w:tcW w:type="dxa" w:w="1200"/>
+            <w:tcMar>
+              <w:top w:type="dxa" w:w="60"/>
+              <w:left w:type="dxa" w:w="100"/>
+              <w:bottom w:type="dxa" w:w="60"/>
+              <w:right w:type="dxa" w:w="100"/>
+            </w:tcMar>
+          </w:tcPr>
+          <w:p>
+            <w:pPr>
+              <w:spacing w:after="0" w:line="240"/>
+              <w:jc w:val="center"/>
+            </w:pPr>
+            <w:r>
+              <w:rPr>
+                <w:rFonts w:ascii="Arial" w:cs="Arial" w:eastAsia="Arial" w:hAnsi="Arial"/>
+                <w:sz w:val="20"/>
+                <w:szCs w:val="20"/>
+              </w:rPr>
+              <w:t xml:space="preserve">1995</w:t>
+            </w:r>
+          </w:p>
+        </w:tc>
+        <w:tc>
+          <w:tcPr>
+            <w:tcW w:type="dxa" w:w="1200"/>
+            <w:tcMar>
+              <w:top w:type="dxa" w:w="60"/>
+              <w:left w:type="dxa" w:w="100"/>
+              <w:bottom w:type="dxa" w:w="60"/>
+              <w:right w:type="dxa" w:w="100"/>
+            </w:tcMar>
+          </w:tcPr>
+          <w:p>
+            <w:pPr>
+              <w:spacing w:after="0" w:line="240"/>
+              <w:jc w:val="center"/>
+            </w:pPr>
+            <w:r>
+              <w:rPr>
+                <w:rFonts w:ascii="Arial" w:cs="Arial" w:eastAsia="Arial" w:hAnsi="Arial"/>
+                <w:sz w:val="20"/>
+                <w:szCs w:val="20"/>
+              </w:rPr>
+              <w:t xml:space="preserve">14</w:t>
+            </w:r>
+          </w:p>
+        </w:tc>
+        <w:tc>
+          <w:tcPr>
+            <w:tcW w:type="dxa" w:w="1800"/>
+            <w:tcMar>
+              <w:top w:type="dxa" w:w="60"/>
+              <w:left w:type="dxa" w:w="100"/>
+              <w:bottom w:type="dxa" w:w="60"/>
+              <w:right w:type="dxa" w:w="100"/>
+            </w:tcMar>
+          </w:tcPr>
+          <w:p>
+            <w:pPr>
+              <w:spacing w:after="0" w:line="240"/>
+              <w:jc w:val="center"/>
+            </w:pPr>
+            <w:r>
+              <w:rPr>
+                <w:rFonts w:ascii="Arial" w:cs="Arial" w:eastAsia="Arial" w:hAnsi="Arial"/>
+                <w:sz w:val="20"/>
+                <w:szCs w:val="20"/>
+              </w:rPr>
+              <w:t xml:space="preserve">14.230</w:t>
+            </w:r>
+          </w:p>
+        </w:tc>
+        <w:tc>
+          <w:tcPr>
+            <w:tcW w:type="dxa" w:w="3000"/>
+            <w:tcMar>
+              <w:top w:type="dxa" w:w="60"/>
+              <w:left w:type="dxa" w:w="100"/>
+              <w:bottom w:type="dxa" w:w="60"/>
+              <w:right w:type="dxa" w:w="100"/>
+            </w:tcMar>
+          </w:tcPr>
+          <w:p>
+            <w:pPr>
+              <w:spacing w:after="0" w:line="240"/>
+              <w:jc w:val="center"/>
+            </w:pPr>
+            <w:r>
+              <w:rPr>
+                <w:rFonts w:ascii="Arial" w:cs="Arial" w:eastAsia="Arial" w:hAnsi="Arial"/>
+                <w:sz w:val="20"/>
+                <w:szCs w:val="20"/>
+              </w:rPr>
+              <w:t xml:space="preserve">5.308 a 155.000</w:t>
+            </w:r>
+          </w:p>
+        </w:tc>
+        <w:tc>
+          <w:tcPr>
+            <w:tcW w:type="dxa" w:w="1826"/>
+            <w:tcMar>
+              <w:top w:type="dxa" w:w="60"/>
+              <w:left w:type="dxa" w:w="100"/>
+              <w:bottom w:type="dxa" w:w="60"/>
+              <w:right w:type="dxa" w:w="100"/>
+            </w:tcMar>
+          </w:tcPr>
+          <w:p>
+            <w:pPr>
+              <w:spacing w:after="0" w:line="240"/>
+              <w:jc w:val="center"/>
+            </w:pPr>
+            <w:r>
+              <w:rPr>
+                <w:rFonts w:ascii="Arial" w:cs="Arial" w:eastAsia="Arial" w:hAnsi="Arial"/>
+                <w:sz w:val="20"/>
+                <w:szCs w:val="20"/>
+              </w:rPr>
+              <w:t xml:space="preserve">50,0%</w:t>
+            </w:r>
+          </w:p>
+        </w:tc>
+      </w:tr>
+      <w:tr>
+        <w:tc>
+          <w:tcPr>
+            <w:tcW w:type="dxa" w:w="1200"/>
+            <w:tcMar>
+              <w:top w:type="dxa" w:w="60"/>
+              <w:left w:type="dxa" w:w="100"/>
+              <w:bottom w:type="dxa" w:w="60"/>
+              <w:right w:type="dxa" w:w="100"/>
+            </w:tcMar>
+          </w:tcPr>
+          <w:p>
+            <w:pPr>
+              <w:spacing w:after="0" w:line="240"/>
+              <w:jc w:val="center"/>
+            </w:pPr>
+            <w:r>
+              <w:rPr>
+                <w:rFonts w:ascii="Arial" w:cs="Arial" w:eastAsia="Arial" w:hAnsi="Arial"/>
+                <w:sz w:val="20"/>
+                <w:szCs w:val="20"/>
+              </w:rPr>
+              <w:t xml:space="preserve">2003</w:t>
+            </w:r>
+          </w:p>
+        </w:tc>
+        <w:tc>
+          <w:tcPr>
+            <w:tcW w:type="dxa" w:w="1200"/>
+            <w:tcMar>
+              <w:top w:type="dxa" w:w="60"/>
+              <w:left w:type="dxa" w:w="100"/>
+              <w:bottom w:type="dxa" w:w="60"/>
+              <w:right w:type="dxa" w:w="100"/>
+            </w:tcMar>
+          </w:tcPr>
+          <w:p>
+            <w:pPr>
+              <w:spacing w:after="0" w:line="240"/>
+              <w:jc w:val="center"/>
+            </w:pPr>
+            <w:r>
+              <w:rPr>
+                <w:rFonts w:ascii="Arial" w:cs="Arial" w:eastAsia="Arial" w:hAnsi="Arial"/>
+                <w:sz w:val="20"/>
+                <w:szCs w:val="20"/>
+              </w:rPr>
+              <w:t xml:space="preserve">30</w:t>
+            </w:r>
+          </w:p>
+        </w:tc>
+        <w:tc>
+          <w:tcPr>
+            <w:tcW w:type="dxa" w:w="1800"/>
+            <w:tcMar>
+              <w:top w:type="dxa" w:w="60"/>
+              <w:left w:type="dxa" w:w="100"/>
+              <w:bottom w:type="dxa" w:w="60"/>
+              <w:right w:type="dxa" w:w="100"/>
+            </w:tcMar>
+          </w:tcPr>
+          <w:p>
+            <w:pPr>
+              <w:spacing w:after="0" w:line="240"/>
+              <w:jc w:val="center"/>
+            </w:pPr>
+            <w:r>
+              <w:rPr>
+                <w:rFonts w:ascii="Arial" w:cs="Arial" w:eastAsia="Arial" w:hAnsi="Arial"/>
+                <w:sz w:val="20"/>
+                <w:szCs w:val="20"/>
+              </w:rPr>
+              <w:t xml:space="preserve">106.579</w:t>
+            </w:r>
+          </w:p>
+        </w:tc>
+        <w:tc>
+          <w:tcPr>
+            <w:tcW w:type="dxa" w:w="3000"/>
+            <w:tcMar>
+              <w:top w:type="dxa" w:w="60"/>
+              <w:left w:type="dxa" w:w="100"/>
+              <w:bottom w:type="dxa" w:w="60"/>
+              <w:right w:type="dxa" w:w="100"/>
+            </w:tcMar>
+          </w:tcPr>
+          <w:p>
+            <w:pPr>
+              <w:spacing w:after="0" w:line="240"/>
+              <w:jc w:val="center"/>
+            </w:pPr>
+            <w:r>
+              <w:rPr>
+                <w:rFonts w:ascii="Arial" w:cs="Arial" w:eastAsia="Arial" w:hAnsi="Arial"/>
+                <w:sz w:val="20"/>
+                <w:szCs w:val="20"/>
+              </w:rPr>
+              <w:t xml:space="preserve">57.066 a 440.066</w:t>
+            </w:r>
+          </w:p>
+        </w:tc>
+        <w:tc>
+          <w:tcPr>
+            <w:tcW w:type="dxa" w:w="1826"/>
+            <w:tcMar>
+              <w:top w:type="dxa" w:w="60"/>
+              <w:left w:type="dxa" w:w="100"/>
+              <w:bottom w:type="dxa" w:w="60"/>
+              <w:right w:type="dxa" w:w="100"/>
+            </w:tcMar>
+          </w:tcPr>
+          <w:p>
+            <w:pPr>
+              <w:spacing w:after="0" w:line="240"/>
+              <w:jc w:val="center"/>
+            </w:pPr>
+            <w:r>
+              <w:rPr>
+                <w:rFonts w:ascii="Arial" w:cs="Arial" w:eastAsia="Arial" w:hAnsi="Arial"/>
+                <w:sz w:val="20"/>
+                <w:szCs w:val="20"/>
+              </w:rPr>
+              <w:t xml:space="preserve">33,3%</w:t>
+            </w:r>
+          </w:p>
+        </w:tc>
+      </w:tr>
+      <w:tr>
+        <w:tc>
+          <w:tcPr>
+            <w:tcW w:type="dxa" w:w="1200"/>
+            <w:tcMar>
+              <w:top w:type="dxa" w:w="60"/>
+              <w:left w:type="dxa" w:w="100"/>
+              <w:bottom w:type="dxa" w:w="60"/>
+              <w:right w:type="dxa" w:w="100"/>
+            </w:tcMar>
+          </w:tcPr>
+          <w:p>
+            <w:pPr>
+              <w:spacing w:after="0" w:line="240"/>
+              <w:jc w:val="center"/>
+            </w:pPr>
+            <w:r>
+              <w:rPr>
+                <w:rFonts w:ascii="Arial" w:cs="Arial" w:eastAsia="Arial" w:hAnsi="Arial"/>
+                <w:sz w:val="20"/>
+                <w:szCs w:val="20"/>
+              </w:rPr>
+              <w:t xml:space="preserve">2013</w:t>
+            </w:r>
+          </w:p>
+        </w:tc>
+        <w:tc>
+          <w:tcPr>
+            <w:tcW w:type="dxa" w:w="1200"/>
+            <w:tcMar>
+              <w:top w:type="dxa" w:w="60"/>
+              <w:left w:type="dxa" w:w="100"/>
+              <w:bottom w:type="dxa" w:w="60"/>
+              <w:right w:type="dxa" w:w="100"/>
+            </w:tcMar>
+          </w:tcPr>
+          <w:p>
+            <w:pPr>
+              <w:spacing w:after="0" w:line="240"/>
+              <w:jc w:val="center"/>
+            </w:pPr>
+            <w:r>
+              <w:rPr>
+                <w:rFonts w:ascii="Arial" w:cs="Arial" w:eastAsia="Arial" w:hAnsi="Arial"/>
+                <w:sz w:val="20"/>
+                <w:szCs w:val="20"/>
+              </w:rPr>
+              <w:t xml:space="preserve">127</w:t>
+            </w:r>
+          </w:p>
+        </w:tc>
+        <w:tc>
+          <w:tcPr>
+            <w:tcW w:type="dxa" w:w="1800"/>
+            <w:tcMar>
+              <w:top w:type="dxa" w:w="60"/>
+              <w:left w:type="dxa" w:w="100"/>
+              <w:bottom w:type="dxa" w:w="60"/>
+              <w:right w:type="dxa" w:w="100"/>
+            </w:tcMar>
+          </w:tcPr>
+          <w:p>
+            <w:pPr>
+              <w:spacing w:after="0" w:line="240"/>
+              <w:jc w:val="center"/>
+            </w:pPr>
+            <w:r>
+              <w:rPr>
+                <w:rFonts w:ascii="Arial" w:cs="Arial" w:eastAsia="Arial" w:hAnsi="Arial"/>
+                <w:sz w:val="20"/>
+                <w:szCs w:val="20"/>
+              </w:rPr>
+              <w:t xml:space="preserve">2.376</w:t>
+            </w:r>
+          </w:p>
+        </w:tc>
+        <w:tc>
+          <w:tcPr>
+            <w:tcW w:type="dxa" w:w="3000"/>
+            <w:tcMar>
+              <w:top w:type="dxa" w:w="60"/>
+              <w:left w:type="dxa" w:w="100"/>
+              <w:bottom w:type="dxa" w:w="60"/>
+              <w:right w:type="dxa" w:w="100"/>
+            </w:tcMar>
+          </w:tcPr>
+          <w:p>
+            <w:pPr>
+              <w:spacing w:after="0" w:line="240"/>
+              <w:jc w:val="center"/>
+            </w:pPr>
+            <w:r>
+              <w:rPr>
+                <w:rFonts w:ascii="Arial" w:cs="Arial" w:eastAsia="Arial" w:hAnsi="Arial"/>
+                <w:sz w:val="20"/>
+                <w:szCs w:val="20"/>
+              </w:rPr>
+              <w:t xml:space="preserve">1.646 a 3.708</w:t>
+            </w:r>
+          </w:p>
+        </w:tc>
+        <w:tc>
+          <w:tcPr>
+            <w:tcW w:type="dxa" w:w="1826"/>
+            <w:tcMar>
+              <w:top w:type="dxa" w:w="60"/>
+              <w:left w:type="dxa" w:w="100"/>
+              <w:bottom w:type="dxa" w:w="60"/>
+              <w:right w:type="dxa" w:w="100"/>
+            </w:tcMar>
+          </w:tcPr>
+          <w:p>
+            <w:pPr>
+              <w:spacing w:after="0" w:line="240"/>
+              <w:jc w:val="center"/>
+            </w:pPr>
+            <w:r>
+              <w:rPr>
+                <w:rFonts w:ascii="Arial" w:cs="Arial" w:eastAsia="Arial" w:hAnsi="Arial"/>
+                <w:sz w:val="20"/>
+                <w:szCs w:val="20"/>
+              </w:rPr>
+              <w:t xml:space="preserve">18,1%</w:t>
+            </w:r>
+          </w:p>
+        </w:tc>
+      </w:tr>
+      <w:tr>
+        <w:tc>
+          <w:tcPr>
+            <w:tcW w:type="dxa" w:w="1200"/>
+            <w:tcMar>
+              <w:top w:type="dxa" w:w="60"/>
+              <w:left w:type="dxa" w:w="100"/>
+              <w:bottom w:type="dxa" w:w="60"/>
+              <w:right w:type="dxa" w:w="100"/>
+            </w:tcMar>
+          </w:tcPr>
+          <w:p>
+            <w:pPr>
+              <w:spacing w:after="0" w:line="240"/>
+              <w:jc w:val="center"/>
+            </w:pPr>
+            <w:r>
+              <w:rPr>
+                <w:rFonts w:ascii="Arial" w:cs="Arial" w:eastAsia="Arial" w:hAnsi="Arial"/>
+                <w:sz w:val="20"/>
+                <w:szCs w:val="20"/>
+              </w:rPr>
+              <w:t xml:space="preserve">2024</w:t>
+            </w:r>
+          </w:p>
+        </w:tc>
+        <w:tc>
+          <w:tcPr>
+            <w:tcW w:type="dxa" w:w="1200"/>
+            <w:tcMar>
+              <w:top w:type="dxa" w:w="60"/>
+              <w:left w:type="dxa" w:w="100"/>
+              <w:bottom w:type="dxa" w:w="60"/>
+              <w:right w:type="dxa" w:w="100"/>
+            </w:tcMar>
+          </w:tcPr>
+          <w:p>
+            <w:pPr>
+              <w:spacing w:after="0" w:line="240"/>
+              <w:jc w:val="center"/>
+            </w:pPr>
+            <w:r>
+              <w:rPr>
+                <w:rFonts w:ascii="Arial" w:cs="Arial" w:eastAsia="Arial" w:hAnsi="Arial"/>
+                <w:sz w:val="20"/>
+                <w:szCs w:val="20"/>
+              </w:rPr>
+              <w:t xml:space="preserve">197</w:t>
+            </w:r>
+          </w:p>
+        </w:tc>
+        <w:tc>
+          <w:tcPr>
+            <w:tcW w:type="dxa" w:w="1800"/>
+            <w:tcMar>
+              <w:top w:type="dxa" w:w="60"/>
+              <w:left w:type="dxa" w:w="100"/>
+              <w:bottom w:type="dxa" w:w="60"/>
+              <w:right w:type="dxa" w:w="100"/>
+            </w:tcMar>
+          </w:tcPr>
+          <w:p>
+            <w:pPr>
+              <w:spacing w:after="0" w:line="240"/>
+              <w:jc w:val="center"/>
+            </w:pPr>
+            <w:r>
+              <w:rPr>
+                <w:rFonts w:ascii="Arial" w:cs="Arial" w:eastAsia="Arial" w:hAnsi="Arial"/>
+                <w:sz w:val="20"/>
+                <w:szCs w:val="20"/>
+              </w:rPr>
+              <w:t xml:space="preserve">933</w:t>
+            </w:r>
+          </w:p>
+        </w:tc>
+        <w:tc>
+          <w:tcPr>
+            <w:tcW w:type="dxa" w:w="3000"/>
+            <w:tcMar>
+              <w:top w:type="dxa" w:w="60"/>
+              <w:left w:type="dxa" w:w="100"/>
+              <w:bottom w:type="dxa" w:w="60"/>
+              <w:right w:type="dxa" w:w="100"/>
+            </w:tcMar>
+          </w:tcPr>
+          <w:p>
+            <w:pPr>
+              <w:spacing w:after="0" w:line="240"/>
+              <w:jc w:val="center"/>
+            </w:pPr>
+            <w:r>
+              <w:rPr>
+                <w:rFonts w:ascii="Arial" w:cs="Arial" w:eastAsia="Arial" w:hAnsi="Arial"/>
+                <w:sz w:val="20"/>
+                <w:szCs w:val="20"/>
+              </w:rPr>
+              <w:t xml:space="preserve">739 a 1.314</w:t>
+            </w:r>
+          </w:p>
+        </w:tc>
+        <w:tc>
+          <w:tcPr>
+            <w:tcW w:type="dxa" w:w="1826"/>
+            <w:tcMar>
+              <w:top w:type="dxa" w:w="60"/>
+              <w:left w:type="dxa" w:w="100"/>
+              <w:bottom w:type="dxa" w:w="60"/>
+              <w:right w:type="dxa" w:w="100"/>
+            </w:tcMar>
+          </w:tcPr>
+          <w:p>
+            <w:pPr>
+              <w:spacing w:after="0" w:line="240"/>
+              <w:jc w:val="center"/>
+            </w:pPr>
+            <w:r>
+              <w:rPr>
+                <w:rFonts w:ascii="Arial" w:cs="Arial" w:eastAsia="Arial" w:hAnsi="Arial"/>
+                <w:sz w:val="20"/>
+                <w:szCs w:val="20"/>
+              </w:rPr>
+              <w:t xml:space="preserve">13,7%</w:t>
+            </w:r>
+          </w:p>
+        </w:tc>
+      </w:tr>
+    </w:tbl>
+    <w:p>
+      <w:pPr>
+        <w:spacing w:after="160"/>
+      </w:pPr>
+    </w:p>
+    <w:p>
+      <w:pPr>
+        <w:spacing w:after="120" w:before="160" w:line="276"/>
+        <w:jc w:val="both"/>
+      </w:pPr>
+      <w:r>
+        <w:rPr>
+          <w:rFonts w:ascii="Arial" w:cs="Arial" w:eastAsia="Arial" w:hAnsi="Arial"/>
+          <w:b w:val="false"/>
+          <w:bCs w:val="false"/>
+          <w:i w:val="false"/>
+          <w:iCs w:val="false"/>
+          <w:sz w:val="22"/>
+          <w:szCs w:val="22"/>
+        </w:rPr>
+        <w:t xml:space="preserve">Na base inteira, 521 filmes, ou 20,0% do total, têm classe indeterminada. Esse número é um teto para qualquer acurácia que a modelagem venha a reportar, e convém enunciá-lo antes do resultado, não depois. Nos anos iniciais da série a instabilidade é particularmente severa: o intervalo de 1995 tem largura equivalente a dez vezes e meia a própria mediana.</w:t>
+      </w:r>
+    </w:p>
+    <w:p>
+      <w:pPr>
+        <w:pStyle w:val="Heading2"/>
+        <w:spacing w:after="140" w:before="280"/>
+      </w:pPr>
+      <w:r>
+        <w:rPr>
+          <w:rFonts w:ascii="Arial" w:cs="Arial" w:eastAsia="Arial" w:hAnsi="Arial"/>
+          <w:b/>
+          <w:bCs/>
+          <w:color w:val="000000"/>
+          <w:sz w:val="24"/>
+          <w:szCs w:val="24"/>
+        </w:rPr>
+        <w:t xml:space="preserve">3.6 O alvo anual depende de informação posterior</w:t>
+      </w:r>
+    </w:p>
+    <w:p>
+      <w:pPr>
+        <w:spacing w:after="120" w:before="160" w:line="276"/>
+        <w:jc w:val="both"/>
+      </w:pPr>
+      <w:r>
+        <w:rPr>
+          <w:rFonts w:ascii="Arial" w:cs="Arial" w:eastAsia="Arial" w:hAnsi="Arial"/>
+          <w:b w:val="false"/>
+          <w:bCs w:val="false"/>
+          <w:i w:val="false"/>
+          <w:iCs w:val="false"/>
+          <w:sz w:val="22"/>
+          <w:szCs w:val="22"/>
+        </w:rPr>
+        <w:t xml:space="preserve">A variável sucesso_no_ano compara o filme com a mediana do ano em que ele estreou, e essa mediana só é conhecida em 31 de dezembro daquele ano. Para prever um filme que estreia em março, o rótulo dependeria de filmes que ainda não estrearam. O mesmo raciocínio se aplica ao atributo filmes_no_ano, que é uma contagem fechada ao fim do ano e, portanto, não observável no momento da previsão. Há ainda uma coluna que é o próprio limiar do alvo, mediana_publico_do_ano, mantida na base por transparência de auditoria e que, se usada como atributo, entregaria metade da resposta ao modelo.</w:t>
+      </w:r>
+    </w:p>
+    <w:p>
+      <w:pPr>
+        <w:spacing w:after="120" w:before="160" w:line="276"/>
+        <w:jc w:val="both"/>
+      </w:pPr>
+      <w:r>
+        <w:rPr>
+          <w:rFonts w:ascii="Arial" w:cs="Arial" w:eastAsia="Arial" w:hAnsi="Arial"/>
+          <w:b w:val="false"/>
+          <w:bCs w:val="false"/>
+          <w:i w:val="false"/>
+          <w:iCs w:val="false"/>
+          <w:sz w:val="22"/>
+          <w:szCs w:val="22"/>
+        </w:rPr>
+        <w:t xml:space="preserve">Por isso a lista de colunas proibidas na modelagem passa a estar declarada em código, na constante COLUNAS_PROIBIDAS de build_dataset.py: publico, renda_corrente, renda_deflacionada_2024, max_salas, mediana_publico_do_ano, filmes_no_ano, sucesso_global e sucesso_no_ano.</w:t>
+      </w:r>
+    </w:p>
+    <w:p>
+      <w:pPr>
+        <w:spacing w:after="120" w:before="160" w:line="276"/>
+        <w:jc w:val="both"/>
+      </w:pPr>
+      <w:r>
+        <w:rPr>
+          <w:rFonts w:ascii="Arial" w:cs="Arial" w:eastAsia="Arial" w:hAnsi="Arial"/>
+          <w:b w:val="false"/>
+          <w:bCs w:val="false"/>
+          <w:i w:val="false"/>
+          <w:iCs w:val="false"/>
+          <w:sz w:val="22"/>
+          <w:szCs w:val="22"/>
+        </w:rPr>
+        <w:t xml:space="preserve">O custo de corrigir essa dependência foi medido. Usar o percentil do ano anterior, que é conhecido, publicado e não contaminado pelo próprio filme, troca a classe de apenas 9,2% dos filmes, com coeficiente kappa de 0,82, e custa 0,03 de área sob a curva ROC, de 0,774 para 0,743.</w:t>
       </w:r>
     </w:p>
     <w:p>

</xml_diff>